<commit_message>
updated the description document
</commit_message>
<xml_diff>
--- a/ShopAssistant.Docs/ShopAssistant-Description.docx
+++ b/ShopAssistant.Docs/ShopAssistant-Description.docx
@@ -7,13 +7,8 @@
         <w:pStyle w:val="Title"/>
         <w:ind w:left="-709"/>
       </w:pPr>
-      <w:proofErr w:type="spellStart"/>
-      <w:r>
-        <w:t>ShopAssistant</w:t>
-      </w:r>
-      <w:proofErr w:type="spellEnd"/>
-      <w:r>
-        <w:t xml:space="preserve"> – solution &amp; workflows</w:t>
+      <w:r>
+        <w:t>ShopAssistant – solution &amp; workflows</w:t>
       </w:r>
     </w:p>
     <w:p>
@@ -24,7 +19,6 @@
       <w:r>
         <w:br/>
       </w:r>
-      <w:proofErr w:type="spellStart"/>
       <w:r>
         <w:rPr>
           <w:b/>
@@ -32,7 +26,6 @@
         </w:rPr>
         <w:t>ShopAssistant</w:t>
       </w:r>
-      <w:proofErr w:type="spellEnd"/>
       <w:r>
         <w:t xml:space="preserve"> is a smart back-end solution that helps online stores deliver </w:t>
       </w:r>
@@ -142,21 +135,12 @@
           <w:szCs w:val="28"/>
         </w:rPr>
       </w:pPr>
-      <w:proofErr w:type="spellStart"/>
       <w:r>
         <w:rPr>
           <w:sz w:val="24"/>
           <w:szCs w:val="24"/>
         </w:rPr>
-        <w:t>ShopAssistant</w:t>
-      </w:r>
-      <w:proofErr w:type="spellEnd"/>
-      <w:r>
-        <w:rPr>
-          <w:sz w:val="24"/>
-          <w:szCs w:val="24"/>
-        </w:rPr>
-        <w:t xml:space="preserve"> is a </w:t>
+        <w:t xml:space="preserve">ShopAssistant is a </w:t>
       </w:r>
       <w:r>
         <w:rPr>
@@ -197,15 +181,7 @@
         <w:ind w:left="-709"/>
       </w:pPr>
       <w:r>
-        <w:t xml:space="preserve">What can </w:t>
-      </w:r>
-      <w:proofErr w:type="spellStart"/>
-      <w:r>
-        <w:t>ShopAssistant</w:t>
-      </w:r>
-      <w:proofErr w:type="spellEnd"/>
-      <w:r>
-        <w:t xml:space="preserve"> do?</w:t>
+        <w:t>What can ShopAssistant do?</w:t>
       </w:r>
     </w:p>
     <w:p>
@@ -390,15 +366,7 @@
       </w:pPr>
       <w:r>
         <w:lastRenderedPageBreak/>
-        <w:t xml:space="preserve">How </w:t>
-      </w:r>
-      <w:proofErr w:type="spellStart"/>
-      <w:r>
-        <w:t>ShopAssistant</w:t>
-      </w:r>
-      <w:proofErr w:type="spellEnd"/>
-      <w:r>
-        <w:t xml:space="preserve"> works</w:t>
+        <w:t>How ShopAssistant works</w:t>
       </w:r>
     </w:p>
     <w:p>
@@ -412,21 +380,12 @@
       <w:r>
         <w:br/>
       </w:r>
-      <w:proofErr w:type="spellStart"/>
       <w:r>
         <w:rPr>
           <w:sz w:val="24"/>
           <w:szCs w:val="24"/>
         </w:rPr>
-        <w:t>ShopAssistant</w:t>
-      </w:r>
-      <w:proofErr w:type="spellEnd"/>
-      <w:r>
-        <w:rPr>
-          <w:sz w:val="24"/>
-          <w:szCs w:val="24"/>
-        </w:rPr>
-        <w:t xml:space="preserve"> can handle both simple and complex requests. For simple FAQs, it returns answers instantly from its knowledge base. For more complex scenarios—like product searches, order status, or delivery address changes—it guides the user with a sequence of clarifying questions, remembering context throughout the conversation.</w:t>
+        <w:t>ShopAssistant can handle both simple and complex requests. For simple FAQs, it returns answers instantly from its knowledge base. For more complex scenarios—like product searches, order status, or delivery address changes—it guides the user with a sequence of clarifying questions, remembering context throughout the conversation.</w:t>
       </w:r>
       <w:r>
         <w:rPr>
@@ -482,23 +441,7 @@
           <w:szCs w:val="24"/>
         </w:rPr>
         <w:br/>
-        <w:t xml:space="preserve">The user’s message is securely received by the </w:t>
-      </w:r>
-      <w:proofErr w:type="spellStart"/>
-      <w:r>
-        <w:rPr>
-          <w:sz w:val="24"/>
-          <w:szCs w:val="24"/>
-        </w:rPr>
-        <w:t>ShopAssistant</w:t>
-      </w:r>
-      <w:proofErr w:type="spellEnd"/>
-      <w:r>
-        <w:rPr>
-          <w:sz w:val="24"/>
-          <w:szCs w:val="24"/>
-        </w:rPr>
-        <w:t xml:space="preserve"> API, which verifies the user’s identity and permissions.</w:t>
+        <w:t>The user’s message is securely received by the ShopAssistant API, which verifies the user’s identity and permissions.</w:t>
       </w:r>
     </w:p>
     <w:p>
@@ -537,23 +480,7 @@
           <w:sz w:val="24"/>
           <w:szCs w:val="24"/>
         </w:rPr>
-        <w:t xml:space="preserve">If the message matches a frequently asked question stored in the cache, </w:t>
-      </w:r>
-      <w:proofErr w:type="spellStart"/>
-      <w:r>
-        <w:rPr>
-          <w:sz w:val="24"/>
-          <w:szCs w:val="24"/>
-        </w:rPr>
-        <w:t>ShopAssistant</w:t>
-      </w:r>
-      <w:proofErr w:type="spellEnd"/>
-      <w:r>
-        <w:rPr>
-          <w:sz w:val="24"/>
-          <w:szCs w:val="24"/>
-        </w:rPr>
-        <w:t xml:space="preserve"> instantly returns the answer.</w:t>
+        <w:t>If the message matches a frequently asked question stored in the cache, ShopAssistant instantly returns the answer.</w:t>
       </w:r>
     </w:p>
     <w:p>
@@ -592,23 +519,7 @@
           <w:sz w:val="24"/>
           <w:szCs w:val="24"/>
         </w:rPr>
-        <w:t xml:space="preserve">If the user is in the middle of a guided conversation (such as product search), </w:t>
-      </w:r>
-      <w:proofErr w:type="spellStart"/>
-      <w:r>
-        <w:rPr>
-          <w:sz w:val="24"/>
-          <w:szCs w:val="24"/>
-        </w:rPr>
-        <w:t>ShopAssistant</w:t>
-      </w:r>
-      <w:proofErr w:type="spellEnd"/>
-      <w:r>
-        <w:rPr>
-          <w:sz w:val="24"/>
-          <w:szCs w:val="24"/>
-        </w:rPr>
-        <w:t xml:space="preserve"> continues the dialog, asking only the next relevant question.</w:t>
+        <w:t>If the user is in the middle of a guided conversation (such as product search), ShopAssistant continues the dialog, asking only the next relevant question.</w:t>
       </w:r>
     </w:p>
     <w:p>
@@ -646,23 +557,7 @@
           <w:szCs w:val="24"/>
         </w:rPr>
         <w:br/>
-        <w:t xml:space="preserve">If not in a dialog, </w:t>
-      </w:r>
-      <w:proofErr w:type="spellStart"/>
-      <w:r>
-        <w:rPr>
-          <w:sz w:val="24"/>
-          <w:szCs w:val="24"/>
-        </w:rPr>
-        <w:t>ShopAssistant</w:t>
-      </w:r>
-      <w:proofErr w:type="spellEnd"/>
-      <w:r>
-        <w:rPr>
-          <w:sz w:val="24"/>
-          <w:szCs w:val="24"/>
-        </w:rPr>
-        <w:t xml:space="preserve"> determines intent in several stages:</w:t>
+        <w:t>If not in a dialog, ShopAssistant determines intent in several stages:</w:t>
       </w:r>
       <w:r>
         <w:rPr>
@@ -720,23 +615,7 @@
           <w:sz w:val="24"/>
           <w:szCs w:val="24"/>
         </w:rPr>
-        <w:t xml:space="preserve">If multiple possible intentions, product categories, or other things are detected, </w:t>
-      </w:r>
-      <w:proofErr w:type="spellStart"/>
-      <w:r>
-        <w:rPr>
-          <w:sz w:val="24"/>
-          <w:szCs w:val="24"/>
-        </w:rPr>
-        <w:t>ShopAssistant</w:t>
-      </w:r>
-      <w:proofErr w:type="spellEnd"/>
-      <w:r>
-        <w:rPr>
-          <w:sz w:val="24"/>
-          <w:szCs w:val="24"/>
-        </w:rPr>
-        <w:t xml:space="preserve"> displays a clarification quest</w:t>
+        <w:t>If multiple possible intentions, product categories, or other things are detected, ShopAssistant displays a clarification quest</w:t>
       </w:r>
       <w:r>
         <w:rPr>
@@ -847,23 +726,7 @@
           <w:szCs w:val="24"/>
         </w:rPr>
         <w:br/>
-        <w:t xml:space="preserve"> If no intent is found, or for general questions, </w:t>
-      </w:r>
-      <w:proofErr w:type="spellStart"/>
-      <w:r>
-        <w:rPr>
-          <w:sz w:val="24"/>
-          <w:szCs w:val="24"/>
-        </w:rPr>
-        <w:t>ShopAssistant</w:t>
-      </w:r>
-      <w:proofErr w:type="spellEnd"/>
-      <w:r>
-        <w:rPr>
-          <w:sz w:val="24"/>
-          <w:szCs w:val="24"/>
-        </w:rPr>
-        <w:t>:</w:t>
+        <w:t xml:space="preserve"> If no intent is found, or for general questions, ShopAssistant:</w:t>
       </w:r>
     </w:p>
     <w:p>
@@ -1073,15 +936,7 @@
         <w:ind w:left="-709"/>
       </w:pPr>
       <w:r>
-        <w:t xml:space="preserve">Understanding intent: How </w:t>
-      </w:r>
-      <w:proofErr w:type="spellStart"/>
-      <w:r>
-        <w:t>ShopAssistant</w:t>
-      </w:r>
-      <w:proofErr w:type="spellEnd"/>
-      <w:r>
-        <w:t xml:space="preserve"> knows what you need</w:t>
+        <w:t>Understanding intent: How ShopAssistant knows what you need</w:t>
       </w:r>
     </w:p>
     <w:p>
@@ -1091,21 +946,12 @@
       <w:r>
         <w:br/>
       </w:r>
-      <w:proofErr w:type="spellStart"/>
       <w:r>
         <w:rPr>
           <w:sz w:val="24"/>
           <w:szCs w:val="24"/>
         </w:rPr>
-        <w:t>ShopAssistant</w:t>
-      </w:r>
-      <w:proofErr w:type="spellEnd"/>
-      <w:r>
-        <w:rPr>
-          <w:sz w:val="24"/>
-          <w:szCs w:val="24"/>
-        </w:rPr>
-        <w:t xml:space="preserve"> is designed to truly “understand” what users want—no matter how they phrase their question. This is achieved by combining several advanced techniques that work together to interpret the intent behind every message.</w:t>
+        <w:t>ShopAssistant is designed to truly “understand” what users want—no matter how they phrase their question. This is achieved by combining several advanced techniques that work together to interpret the intent behind every message.</w:t>
       </w:r>
       <w:r>
         <w:rPr>
@@ -1136,23 +982,7 @@
           <w:sz w:val="24"/>
           <w:szCs w:val="24"/>
         </w:rPr>
-        <w:t xml:space="preserve">: </w:t>
-      </w:r>
-      <w:proofErr w:type="spellStart"/>
-      <w:r>
-        <w:rPr>
-          <w:sz w:val="24"/>
-          <w:szCs w:val="24"/>
-        </w:rPr>
-        <w:t>ShopAssistant</w:t>
-      </w:r>
-      <w:proofErr w:type="spellEnd"/>
-      <w:r>
-        <w:rPr>
-          <w:sz w:val="24"/>
-          <w:szCs w:val="24"/>
-        </w:rPr>
-        <w:t xml:space="preserve"> leverages configurable templates and regular expressions to instantly recognize well-known question formats. This allows for rapid identification of routine requests, such as asking for store hours, return policies, or order tracking.</w:t>
+        <w:t>: ShopAssistant leverages configurable templates and regular expressions to instantly recognize well-known question formats. This allows for rapid identification of routine requests, such as asking for store hours, return policies, or order tracking.</w:t>
       </w:r>
       <w:r>
         <w:rPr>
@@ -1183,23 +1013,7 @@
           <w:sz w:val="24"/>
           <w:szCs w:val="24"/>
         </w:rPr>
-        <w:t xml:space="preserve">: The system uses a pre-trained sentence embedding model to analyze the meaning of each message, not just its keywords. By converting both user queries and stored example phrases into vector embeddings, </w:t>
-      </w:r>
-      <w:proofErr w:type="spellStart"/>
-      <w:r>
-        <w:rPr>
-          <w:sz w:val="24"/>
-          <w:szCs w:val="24"/>
-        </w:rPr>
-        <w:t>ShopAssistant</w:t>
-      </w:r>
-      <w:proofErr w:type="spellEnd"/>
-      <w:r>
-        <w:rPr>
-          <w:sz w:val="24"/>
-          <w:szCs w:val="24"/>
-        </w:rPr>
-        <w:t xml:space="preserve"> can accurately identify the intent even if the user’s wording is unfamiliar or unique. This ensures that a wide variety of questions—regardless of phrasing, synonyms, or language—are correctly understood and routed.</w:t>
+        <w:t>: The system uses a pre-trained sentence embedding model to analyze the meaning of each message, not just its keywords. By converting both user queries and stored example phrases into vector embeddings, ShopAssistant can accurately identify the intent even if the user’s wording is unfamiliar or unique. This ensures that a wide variety of questions—regardless of phrasing, synonyms, or language—are correctly understood and routed.</w:t>
       </w:r>
       <w:r>
         <w:rPr>
@@ -1261,23 +1075,7 @@
           <w:sz w:val="24"/>
           <w:szCs w:val="24"/>
         </w:rPr>
-        <w:t xml:space="preserve">: </w:t>
-      </w:r>
-      <w:proofErr w:type="spellStart"/>
-      <w:r>
-        <w:rPr>
-          <w:sz w:val="24"/>
-          <w:szCs w:val="24"/>
-        </w:rPr>
-        <w:t>ShopAssistant</w:t>
-      </w:r>
-      <w:proofErr w:type="spellEnd"/>
-      <w:r>
-        <w:rPr>
-          <w:sz w:val="24"/>
-          <w:szCs w:val="24"/>
-        </w:rPr>
-        <w:t xml:space="preserve"> applies these techniques in layers—first looking for exact pattern matches, then analyzing for semantic similarity, and finally checking configurable intent patterns. This layered approach balances speed and flexibility, delivering accurate results with minimal effort from the user.</w:t>
+        <w:t>: ShopAssistant applies these techniques in layers—first looking for exact pattern matches, then analyzing for semantic similarity, and finally checking configurable intent patterns. This layered approach balances speed and flexibility, delivering accurate results with minimal effort from the user.</w:t>
       </w:r>
       <w:r>
         <w:rPr>
@@ -1308,23 +1106,7 @@
           <w:sz w:val="24"/>
           <w:szCs w:val="24"/>
         </w:rPr>
-        <w:t xml:space="preserve">: Because intents and example phrases are stored in external files, your team can continually refine and expand what </w:t>
-      </w:r>
-      <w:proofErr w:type="spellStart"/>
-      <w:r>
-        <w:rPr>
-          <w:sz w:val="24"/>
-          <w:szCs w:val="24"/>
-        </w:rPr>
-        <w:t>ShopAssistant</w:t>
-      </w:r>
-      <w:proofErr w:type="spellEnd"/>
-      <w:r>
-        <w:rPr>
-          <w:sz w:val="24"/>
-          <w:szCs w:val="24"/>
-        </w:rPr>
-        <w:t xml:space="preserve"> understands. New question types, alternative phrasings, and business rules can be added on-the-fly, ensuring the assistant always stays aligned with your evolving business needs.</w:t>
+        <w:t>: Because intents and example phrases are stored in external files, your team can continually refine and expand what ShopAssistant understands. New question types, alternative phrasings, and business rules can be added on-the-fly, ensuring the assistant always stays aligned with your evolving business needs.</w:t>
       </w:r>
       <w:r>
         <w:rPr>
@@ -1493,161 +1275,57 @@
           <w:rFonts w:asciiTheme="minorHAnsi" w:hAnsiTheme="minorHAnsi"/>
         </w:rPr>
         <w:br/>
-        <w:t xml:space="preserve">The system merges the results from both methods. Vector search ensures semantically similar questions are found, while BM25 ensures that common customer phrasings and exact wording variations are not missed. A weighted scoring process blends the two, and the system applies role-based access rules so restricted topics (like </w:t>
-      </w:r>
-      <w:r>
-        <w:rPr>
-          <w:rStyle w:val="Emphasis"/>
-          <w:rFonts w:asciiTheme="minorHAnsi" w:hAnsiTheme="minorHAnsi"/>
-        </w:rPr>
-        <w:t>Portal</w:t>
-      </w:r>
-      <w:r>
-        <w:rPr>
-          <w:rFonts w:asciiTheme="minorHAnsi" w:hAnsiTheme="minorHAnsi"/>
-        </w:rPr>
-        <w:t>) are only shown to authorized users.</w:t>
+        <w:t>The system merges the results from both methods. Vector search ensures semantically similar questions are found, while BM25 ensures that common customer phrasings and exact wording variations are not missed. A weighted scoring process blends the two, and the system applies role-based access rules so restricted topics are only shown to authorized users.</w:t>
       </w:r>
     </w:p>
     <w:p>
       <w:pPr>
         <w:pStyle w:val="NormalWeb"/>
         <w:ind w:left="-851"/>
-        <w:jc w:val="both"/>
+      </w:pPr>
+      <w:r>
         <w:rPr>
           <w:rFonts w:asciiTheme="minorHAnsi" w:hAnsiTheme="minorHAnsi"/>
         </w:rPr>
-      </w:pPr>
-      <w:r>
-        <w:rPr>
-          <w:rFonts w:asciiTheme="minorHAnsi" w:hAnsiTheme="minorHAnsi"/>
-        </w:rPr>
-        <w:t xml:space="preserve">The </w:t>
+        <w:t xml:space="preserve">By combining these approaches, the system delivers answers that are </w:t>
       </w:r>
       <w:r>
         <w:rPr>
           <w:rStyle w:val="Strong"/>
           <w:rFonts w:asciiTheme="minorHAnsi" w:hAnsiTheme="minorHAnsi"/>
         </w:rPr>
-        <w:t>hybrid approach</w:t>
+        <w:t>accurate, flexible, and secure</w:t>
       </w:r>
       <w:r>
         <w:rPr>
           <w:rFonts w:asciiTheme="minorHAnsi" w:hAnsiTheme="minorHAnsi"/>
         </w:rPr>
-        <w:t xml:space="preserve"> blends these two methods into a single result set. Vector search ensures semantic coverage, while BM25 ensures that important keywords and identifiers are not missed. A weighted scoring process merges the results, and additional safeguards give preference to answers that share direct word overlap with the query. Role-based access rules are also enforced, so restricted topics (such as </w:t>
-      </w:r>
-      <w:r>
-        <w:rPr>
-          <w:rStyle w:val="Emphasis"/>
+        <w:t xml:space="preserve"> </w:t>
+      </w:r>
+      <w:r>
+        <w:rPr>
           <w:rFonts w:asciiTheme="minorHAnsi" w:hAnsiTheme="minorHAnsi"/>
         </w:rPr>
-        <w:t>Portal</w:t>
+        <w:t>-</w:t>
       </w:r>
       <w:r>
         <w:rPr>
           <w:rFonts w:asciiTheme="minorHAnsi" w:hAnsiTheme="minorHAnsi"/>
         </w:rPr>
-        <w:t>) are only shown to authorized users.</w:t>
+        <w:t xml:space="preserve"> handling conversational language naturally, while also covering the many ways customers may phrase the same FAQ question.</w:t>
       </w:r>
     </w:p>
     <w:p>
       <w:pPr>
-        <w:pStyle w:val="NormalWeb"/>
-        <w:ind w:left="-851"/>
-        <w:rPr>
-          <w:rFonts w:asciiTheme="minorHAnsi" w:hAnsiTheme="minorHAnsi"/>
-        </w:rPr>
-      </w:pPr>
-      <w:r>
-        <w:rPr>
-          <w:rFonts w:asciiTheme="minorHAnsi" w:hAnsiTheme="minorHAnsi"/>
-        </w:rPr>
-        <w:t xml:space="preserve">By combining these approaches, the system delivers answers that are </w:t>
-      </w:r>
-      <w:r>
-        <w:rPr>
-          <w:rStyle w:val="Strong"/>
-          <w:rFonts w:asciiTheme="minorHAnsi" w:hAnsiTheme="minorHAnsi"/>
-        </w:rPr>
-        <w:t>accurate, flexible, and secure</w:t>
-      </w:r>
-      <w:r>
-        <w:rPr>
-          <w:rFonts w:asciiTheme="minorHAnsi" w:hAnsiTheme="minorHAnsi"/>
-        </w:rPr>
-        <w:t xml:space="preserve"> </w:t>
-      </w:r>
-      <w:r>
-        <w:rPr>
-          <w:rFonts w:asciiTheme="minorHAnsi" w:hAnsiTheme="minorHAnsi"/>
-        </w:rPr>
-        <w:t>-</w:t>
-      </w:r>
-      <w:r>
-        <w:rPr>
-          <w:rFonts w:asciiTheme="minorHAnsi" w:hAnsiTheme="minorHAnsi"/>
-        </w:rPr>
-        <w:t xml:space="preserve"> handling conversational language naturally, while also covering the many ways customers may phrase the same FAQ question.</w:t>
+        <w:pStyle w:val="Heading1"/>
+        <w:ind w:left="-993"/>
+      </w:pPr>
+      <w:r>
+        <w:t>Multi-turn dialogs</w:t>
       </w:r>
     </w:p>
     <w:p>
       <w:pPr>
-        <w:ind w:left="-426" w:hanging="425"/>
-      </w:pPr>
-    </w:p>
-    <w:p>
-      <w:pPr>
-        <w:ind w:left="-426" w:hanging="425"/>
-      </w:pPr>
-    </w:p>
-    <w:p>
-      <w:pPr>
-        <w:ind w:left="-426" w:hanging="425"/>
-      </w:pPr>
-    </w:p>
-    <w:p>
-      <w:pPr>
-        <w:ind w:left="-426" w:hanging="425"/>
-      </w:pPr>
-    </w:p>
-    <w:p>
-      <w:pPr>
-        <w:ind w:left="-426" w:hanging="425"/>
-      </w:pPr>
-    </w:p>
-    <w:p>
-      <w:pPr>
-        <w:ind w:left="-426" w:hanging="425"/>
-      </w:pPr>
-    </w:p>
-    <w:p>
-      <w:pPr>
-        <w:ind w:left="-426" w:hanging="425"/>
-      </w:pPr>
-    </w:p>
-    <w:p>
-      <w:pPr>
-        <w:ind w:left="-426" w:hanging="425"/>
-      </w:pPr>
-    </w:p>
-    <w:p>
-      <w:pPr>
-        <w:ind w:left="-426" w:hanging="425"/>
-      </w:pPr>
-    </w:p>
-    <w:p>
-      <w:pPr>
-        <w:pStyle w:val="Heading1"/>
-        <w:ind w:left="-993"/>
-      </w:pPr>
-      <w:r>
-        <w:lastRenderedPageBreak/>
-        <w:t>Multi-turn dialogs</w:t>
-      </w:r>
-    </w:p>
-    <w:p>
-      <w:pPr>
         <w:ind w:left="-993"/>
         <w:rPr>
           <w:sz w:val="24"/>
@@ -1660,29 +1338,7 @@
           <w:szCs w:val="24"/>
         </w:rPr>
         <w:br/>
-      </w:r>
-      <w:proofErr w:type="spellStart"/>
-      <w:r>
-        <w:rPr>
-          <w:sz w:val="24"/>
-          <w:szCs w:val="24"/>
-        </w:rPr>
-        <w:t>ShopAssistant</w:t>
-      </w:r>
-      <w:proofErr w:type="spellEnd"/>
-      <w:r>
-        <w:rPr>
-          <w:sz w:val="24"/>
-          <w:szCs w:val="24"/>
-        </w:rPr>
-        <w:t xml:space="preserve"> handles complex workflows- such as product search, order tracking, or address changes - using multi-turn dialogs that guide users through a step-by-step process.</w:t>
-      </w:r>
-      <w:r>
-        <w:rPr>
-          <w:sz w:val="24"/>
-          <w:szCs w:val="24"/>
-        </w:rPr>
-        <w:br/>
+        <w:t>ShopAssistant handles complex workflows- such as product search, order tracking, or address changes - using multi-turn dialogs that guide users through a step-by-step process.</w:t>
       </w:r>
     </w:p>
     <w:p>
@@ -1712,23 +1368,7 @@
           <w:sz w:val="24"/>
           <w:szCs w:val="24"/>
         </w:rPr>
-        <w:t xml:space="preserve">: When a user’s request matches an intent that requires more information, </w:t>
-      </w:r>
-      <w:proofErr w:type="spellStart"/>
-      <w:r>
-        <w:rPr>
-          <w:sz w:val="24"/>
-          <w:szCs w:val="24"/>
-        </w:rPr>
-        <w:t>ShopAssistant</w:t>
-      </w:r>
-      <w:proofErr w:type="spellEnd"/>
-      <w:r>
-        <w:rPr>
-          <w:sz w:val="24"/>
-          <w:szCs w:val="24"/>
-        </w:rPr>
-        <w:t xml:space="preserve"> dynamically determines which details are missing and asks follow-up questions, one at a time.</w:t>
+        <w:t>: When a user’s request matches an intent that requires more information, ShopAssistant dynamically determines which details are missing and asks follow-up questions, one at a time.</w:t>
       </w:r>
     </w:p>
     <w:p>
@@ -1779,23 +1419,7 @@
           <w:sz w:val="24"/>
           <w:szCs w:val="24"/>
         </w:rPr>
-        <w:t xml:space="preserve">If several possible categories of products or other things are found, </w:t>
-      </w:r>
-      <w:proofErr w:type="spellStart"/>
-      <w:r>
-        <w:rPr>
-          <w:sz w:val="24"/>
-          <w:szCs w:val="24"/>
-        </w:rPr>
-        <w:t>ShopAssistant</w:t>
-      </w:r>
-      <w:proofErr w:type="spellEnd"/>
-      <w:r>
-        <w:rPr>
-          <w:sz w:val="24"/>
-          <w:szCs w:val="24"/>
-        </w:rPr>
-        <w:t xml:space="preserve"> displays a clarifying question with a set of possible alternatives. After the user makes a selection, the conversation continues without interruption.</w:t>
+        <w:t>If several possible categories of products or other things are found, ShopAssistant displays a clarifying question with a set of possible alternatives. After the user makes a selection, the conversation continues without interruption.</w:t>
       </w:r>
     </w:p>
     <w:p>
@@ -1855,23 +1479,7 @@
           <w:sz w:val="24"/>
           <w:szCs w:val="24"/>
         </w:rPr>
-        <w:t xml:space="preserve">: Once all required information is collected, </w:t>
-      </w:r>
-      <w:proofErr w:type="spellStart"/>
-      <w:r>
-        <w:rPr>
-          <w:sz w:val="24"/>
-          <w:szCs w:val="24"/>
-        </w:rPr>
-        <w:t>ShopAssistant</w:t>
-      </w:r>
-      <w:proofErr w:type="spellEnd"/>
-      <w:r>
-        <w:rPr>
-          <w:sz w:val="24"/>
-          <w:szCs w:val="24"/>
-        </w:rPr>
-        <w:t xml:space="preserve"> executes the relevant business logic by calling the specific intent handler, such as looking up order status or searching for products.</w:t>
+        <w:t>: Once all required information is collected, ShopAssistant executes the relevant business logic by calling the specific intent handler, such as looking up order status or searching for products.</w:t>
       </w:r>
     </w:p>
     <w:p>
@@ -1952,108 +1560,15 @@
           <w:sz w:val="24"/>
           <w:szCs w:val="24"/>
         </w:rPr>
-        <w:br/>
+        <w:t xml:space="preserve"> </w:t>
       </w:r>
       <w:r>
         <w:rPr>
           <w:sz w:val="24"/>
           <w:szCs w:val="24"/>
         </w:rPr>
-        <w:br/>
-      </w:r>
-      <w:r>
-        <w:rPr>
-          <w:sz w:val="24"/>
-          <w:szCs w:val="24"/>
-        </w:rPr>
         <w:t>The sequence of questions is defined in the configuration file and can be changed in accordance with changes in business needs.</w:t>
       </w:r>
-      <w:r>
-        <w:rPr>
-          <w:sz w:val="24"/>
-          <w:szCs w:val="24"/>
-        </w:rPr>
-        <w:br/>
-      </w:r>
-      <w:r>
-        <w:rPr>
-          <w:sz w:val="24"/>
-          <w:szCs w:val="24"/>
-        </w:rPr>
-        <w:br/>
-      </w:r>
-    </w:p>
-    <w:p>
-      <w:pPr>
-        <w:rPr>
-          <w:sz w:val="24"/>
-          <w:szCs w:val="24"/>
-        </w:rPr>
-      </w:pPr>
-    </w:p>
-    <w:p>
-      <w:pPr>
-        <w:rPr>
-          <w:sz w:val="24"/>
-          <w:szCs w:val="24"/>
-        </w:rPr>
-      </w:pPr>
-    </w:p>
-    <w:p>
-      <w:pPr>
-        <w:rPr>
-          <w:sz w:val="24"/>
-          <w:szCs w:val="24"/>
-        </w:rPr>
-      </w:pPr>
-    </w:p>
-    <w:p>
-      <w:pPr>
-        <w:rPr>
-          <w:sz w:val="24"/>
-          <w:szCs w:val="24"/>
-        </w:rPr>
-      </w:pPr>
-    </w:p>
-    <w:p>
-      <w:pPr>
-        <w:rPr>
-          <w:sz w:val="24"/>
-          <w:szCs w:val="24"/>
-        </w:rPr>
-      </w:pPr>
-    </w:p>
-    <w:p>
-      <w:pPr>
-        <w:rPr>
-          <w:sz w:val="24"/>
-          <w:szCs w:val="24"/>
-        </w:rPr>
-      </w:pPr>
-    </w:p>
-    <w:p>
-      <w:pPr>
-        <w:rPr>
-          <w:sz w:val="24"/>
-          <w:szCs w:val="24"/>
-        </w:rPr>
-      </w:pPr>
-    </w:p>
-    <w:p>
-      <w:pPr>
-        <w:rPr>
-          <w:sz w:val="24"/>
-          <w:szCs w:val="24"/>
-        </w:rPr>
-      </w:pPr>
-    </w:p>
-    <w:p>
-      <w:pPr>
-        <w:rPr>
-          <w:sz w:val="24"/>
-          <w:szCs w:val="24"/>
-        </w:rPr>
-      </w:pPr>
     </w:p>
     <w:p>
       <w:pPr>
@@ -2160,22 +1675,7 @@
           <w:szCs w:val="24"/>
         </w:rPr>
         <w:br/>
-      </w:r>
-      <w:proofErr w:type="spellStart"/>
-      <w:r>
-        <w:rPr>
-          <w:sz w:val="24"/>
-          <w:szCs w:val="24"/>
-        </w:rPr>
-        <w:t>ShopAssistant</w:t>
-      </w:r>
-      <w:proofErr w:type="spellEnd"/>
-      <w:r>
-        <w:rPr>
-          <w:sz w:val="24"/>
-          <w:szCs w:val="24"/>
-        </w:rPr>
-        <w:t xml:space="preserve"> uses JWT tokens for secure authentication and authorization. Some topics or answers are restricted based on user role (e.g., customer, staff, admin). These restrictions are enforced automatically, and semantic search only considers answers within the allowed topics for each user.</w:t>
+        <w:t>ShopAssistant uses JWT tokens for secure authentication and authorization. Some topics or answers are restricted based on user role (e.g., customer, staff, admin). These restrictions are enforced automatically, and semantic search only considers answers within the allowed topics for each user.</w:t>
       </w:r>
     </w:p>
     <w:p>
@@ -2359,39 +1859,7 @@
           <w:sz w:val="24"/>
           <w:szCs w:val="24"/>
         </w:rPr>
-        <w:t xml:space="preserve">• Intent detection uses a hybrid approach: regex/pattern match, stemming, and finally embedding similarity (using </w:t>
-      </w:r>
-      <w:proofErr w:type="spellStart"/>
-      <w:r>
-        <w:rPr>
-          <w:sz w:val="24"/>
-          <w:szCs w:val="24"/>
-        </w:rPr>
-        <w:t>LaBSE</w:t>
-      </w:r>
-      <w:proofErr w:type="spellEnd"/>
-      <w:r>
-        <w:rPr>
-          <w:sz w:val="24"/>
-          <w:szCs w:val="24"/>
-        </w:rPr>
-        <w:t xml:space="preserve"> and </w:t>
-      </w:r>
-      <w:proofErr w:type="spellStart"/>
-      <w:r>
-        <w:rPr>
-          <w:sz w:val="24"/>
-          <w:szCs w:val="24"/>
-        </w:rPr>
-        <w:t>OnnxRuntime</w:t>
-      </w:r>
-      <w:proofErr w:type="spellEnd"/>
-      <w:r>
-        <w:rPr>
-          <w:sz w:val="24"/>
-          <w:szCs w:val="24"/>
-        </w:rPr>
-        <w:t>).</w:t>
+        <w:t>• Intent detection uses a hybrid approach: regex/pattern match, stemming, and finally embedding similarity (using LaBSE and OnnxRuntime).</w:t>
       </w:r>
     </w:p>
     <w:p>
@@ -15482,7 +14950,6 @@
     <w:name w:val="Normal (Web)"/>
     <w:basedOn w:val="Normal"/>
     <w:uiPriority w:val="99"/>
-    <w:semiHidden/>
     <w:unhideWhenUsed/>
     <w:rsid w:val="006666AB"/>
     <w:pPr>

</xml_diff>